<commit_message>
Remove Backup Debug panel; add OAuth secret samples in docs
Drop the unused Debug section from Backup & Restore. Update the
setup guide/DOCX with sample Client ID and Client Secret values.

Co-authored-by: samzion1982-byte <samzion1982-byte@users.noreply.github.com>
</commit_message>
<xml_diff>
--- a/docs/Google_Drive_Backup_Setup_Guide.docx
+++ b/docs/Google_Drive_Backup_Setup_Guide.docx
@@ -243,7 +243,7 @@
         <w:pStyle w:val="ListNumber"/>
       </w:pPr>
       <w:r>
-        <w:t>Run diagnostics + first backup</w:t>
+        <w:t>First backup smoke test</w:t>
       </w:r>
     </w:p>
     <w:p>
@@ -374,6 +374,20 @@
       </w:r>
     </w:p>
     <w:p>
+      <w:r>
+        <w:t xml:space="preserve">&gt; Tip: One Google Cloud project can serve several church websites if you add </w:t>
+      </w:r>
+      <w:r>
+        <w:rPr>
+          <w:b/>
+        </w:rPr>
+        <w:t>each site’s redirect URI</w:t>
+      </w:r>
+      <w:r>
+        <w:t xml:space="preserve"> to the same OAuth client. Or create one project per church — both work.</w:t>
+      </w:r>
+    </w:p>
+    <w:p>
       <w:pPr>
         <w:pStyle w:val="Heading1"/>
       </w:pPr>
@@ -717,6 +731,29 @@
       </w:r>
     </w:p>
     <w:p>
+      <w:r>
+        <w:t xml:space="preserve">&gt; While status is </w:t>
+      </w:r>
+      <w:r>
+        <w:rPr>
+          <w:b/>
+        </w:rPr>
+        <w:t>Testing</w:t>
+      </w:r>
+      <w:r>
+        <w:t xml:space="preserve">, only listed </w:t>
+      </w:r>
+      <w:r>
+        <w:rPr>
+          <w:b/>
+        </w:rPr>
+        <w:t>Test users</w:t>
+      </w:r>
+      <w:r>
+        <w:t xml:space="preserve"> can complete OAuth.</w:t>
+      </w:r>
+    </w:p>
+    <w:p>
       <w:pPr>
         <w:ind w:left="288"/>
       </w:pPr>
@@ -744,6 +781,20 @@
       </w:r>
     </w:p>
     <w:p>
+      <w:r>
+        <w:t xml:space="preserve">&gt; “App not verified” / “Access blocked” usually means the Google account is </w:t>
+      </w:r>
+      <w:r>
+        <w:rPr>
+          <w:b/>
+        </w:rPr>
+        <w:t>not</w:t>
+      </w:r>
+      <w:r>
+        <w:t xml:space="preserve"> in Test users.</w:t>
+      </w:r>
+    </w:p>
+    <w:p>
       <w:pPr>
         <w:pStyle w:val="Heading1"/>
       </w:pPr>
@@ -962,7 +1013,7 @@
         <w:pStyle w:val="ListNumber"/>
       </w:pPr>
       <w:r>
-        <w:t>Copy and store securely:</w:t>
+        <w:t>Copy and store securely (paste these into Supabase Edge Function secrets):</w:t>
       </w:r>
     </w:p>
     <w:p>
@@ -975,6 +1026,30 @@
         </w:rPr>
         <w:t>Client ID</w:t>
       </w:r>
+      <w:r>
+        <w:t xml:space="preserve"> → secret name </w:t>
+      </w:r>
+      <w:r>
+        <w:rPr>
+          <w:rFonts w:ascii="Consolas" w:hAnsi="Consolas"/>
+          <w:color w:val="115E59"/>
+          <w:sz w:val="20"/>
+        </w:rPr>
+        <w:t>GOOGLE_OAUTH_CLIENT_ID</w:t>
+      </w:r>
+    </w:p>
+    <w:p>
+      <w:r>
+        <w:t xml:space="preserve">     Sample look: </w:t>
+      </w:r>
+      <w:r>
+        <w:rPr>
+          <w:rFonts w:ascii="Consolas" w:hAnsi="Consolas"/>
+          <w:color w:val="115E59"/>
+          <w:sz w:val="20"/>
+        </w:rPr>
+        <w:t>123456789012-abcdefghijklmnop.apps.googleusercontent.com</w:t>
+      </w:r>
     </w:p>
     <w:p>
       <w:r>
@@ -985,6 +1060,30 @@
           <w:b/>
         </w:rPr>
         <w:t>Client secret</w:t>
+      </w:r>
+      <w:r>
+        <w:t xml:space="preserve"> → secret name </w:t>
+      </w:r>
+      <w:r>
+        <w:rPr>
+          <w:rFonts w:ascii="Consolas" w:hAnsi="Consolas"/>
+          <w:color w:val="115E59"/>
+          <w:sz w:val="20"/>
+        </w:rPr>
+        <w:t>GOOGLE_OAUTH_CLIENT_SECRET</w:t>
+      </w:r>
+    </w:p>
+    <w:p>
+      <w:r>
+        <w:t xml:space="preserve">     Sample look: </w:t>
+      </w:r>
+      <w:r>
+        <w:rPr>
+          <w:rFonts w:ascii="Consolas" w:hAnsi="Consolas"/>
+          <w:color w:val="115E59"/>
+          <w:sz w:val="20"/>
+        </w:rPr>
+        <w:t>GOCSPX-abcdefghijklmnopqrstuvwx</w:t>
       </w:r>
     </w:p>
     <w:p>
@@ -1009,6 +1108,19 @@
       </w:r>
     </w:p>
     <w:p>
+      <w:r>
+        <w:t xml:space="preserve">&gt; The CMS builds the redirect as: </w:t>
+      </w:r>
+      <w:r>
+        <w:rPr>
+          <w:rFonts w:ascii="Consolas" w:hAnsi="Consolas"/>
+          <w:color w:val="115E59"/>
+          <w:sz w:val="20"/>
+        </w:rPr>
+        <w:t>{window.location.origin}/backup/google-callback</w:t>
+      </w:r>
+    </w:p>
+    <w:p>
       <w:pPr>
         <w:ind w:left="288"/>
       </w:pPr>
@@ -1018,6 +1130,11 @@
           <w:color w:val="475569"/>
         </w:rPr>
         <w:t>You can also copy the exact URI from Backup page (Google Drive section).</w:t>
+      </w:r>
+    </w:p>
+    <w:p>
+      <w:r>
+        <w:t>&gt; You can also copy the exact URI from Backup page (Google Drive section).</w:t>
       </w:r>
     </w:p>
     <w:p>
@@ -1397,13 +1514,14 @@
         <w:tblLook w:firstColumn="1" w:firstRow="1" w:lastColumn="0" w:lastRow="0" w:noHBand="0" w:noVBand="1" w:val="04A0"/>
       </w:tblPr>
       <w:tblGrid>
-        <w:gridCol w:w="4824"/>
-        <w:gridCol w:w="4824"/>
+        <w:gridCol w:w="3216"/>
+        <w:gridCol w:w="3216"/>
+        <w:gridCol w:w="3216"/>
       </w:tblGrid>
       <w:tr>
         <w:tc>
           <w:tcPr>
-            <w:tcW w:type="dxa" w:w="4824"/>
+            <w:tcW w:type="dxa" w:w="3216"/>
           </w:tcPr>
           <w:p>
             <w:r>
@@ -1416,13 +1534,13 @@
                 <w:b/>
                 <w:sz w:val="18"/>
               </w:rPr>
-              <w:t>Secret</w:t>
+              <w:t>Secret name (exact)</w:t>
             </w:r>
           </w:p>
         </w:tc>
         <w:tc>
           <w:tcPr>
-            <w:tcW w:type="dxa" w:w="4824"/>
+            <w:tcW w:type="dxa" w:w="3216"/>
           </w:tcPr>
           <w:p>
             <w:r>
@@ -1435,7 +1553,26 @@
                 <w:b/>
                 <w:sz w:val="18"/>
               </w:rPr>
-              <w:t>Value</w:t>
+              <w:t>What to paste</w:t>
+            </w:r>
+          </w:p>
+        </w:tc>
+        <w:tc>
+          <w:tcPr>
+            <w:tcW w:type="dxa" w:w="3216"/>
+          </w:tcPr>
+          <w:p>
+            <w:r>
+              <w:rPr>
+                <w:sz w:val="18"/>
+              </w:rPr>
+            </w:r>
+            <w:r>
+              <w:rPr>
+                <w:b/>
+                <w:sz w:val="18"/>
+              </w:rPr>
+              <w:t>Sample / how it looks</w:t>
             </w:r>
           </w:p>
         </w:tc>
@@ -1443,7 +1580,7 @@
       <w:tr>
         <w:tc>
           <w:tcPr>
-            <w:tcW w:type="dxa" w:w="4824"/>
+            <w:tcW w:type="dxa" w:w="3216"/>
           </w:tcPr>
           <w:p>
             <w:r>
@@ -1463,7 +1600,7 @@
         </w:tc>
         <w:tc>
           <w:tcPr>
-            <w:tcW w:type="dxa" w:w="4824"/>
+            <w:tcW w:type="dxa" w:w="3216"/>
           </w:tcPr>
           <w:p>
             <w:r>
@@ -1475,7 +1612,40 @@
               <w:rPr>
                 <w:sz w:val="18"/>
               </w:rPr>
-              <w:t>OAuth Client ID from Step 4</w:t>
+              <w:t xml:space="preserve">OAuth </w:t>
+            </w:r>
+            <w:r>
+              <w:rPr>
+                <w:b/>
+                <w:sz w:val="18"/>
+              </w:rPr>
+              <w:t>Client ID</w:t>
+            </w:r>
+            <w:r>
+              <w:rPr>
+                <w:sz w:val="18"/>
+              </w:rPr>
+              <w:t xml:space="preserve"> from Step 4</w:t>
+            </w:r>
+          </w:p>
+        </w:tc>
+        <w:tc>
+          <w:tcPr>
+            <w:tcW w:type="dxa" w:w="3216"/>
+          </w:tcPr>
+          <w:p>
+            <w:r>
+              <w:rPr>
+                <w:sz w:val="18"/>
+              </w:rPr>
+            </w:r>
+            <w:r>
+              <w:rPr>
+                <w:rFonts w:ascii="Consolas" w:hAnsi="Consolas"/>
+                <w:color w:val="115E59"/>
+                <w:sz w:val="18"/>
+              </w:rPr>
+              <w:t>123456789012-abcdefghijklmnop.apps.googleusercontent.com</w:t>
             </w:r>
           </w:p>
         </w:tc>
@@ -1483,7 +1653,7 @@
       <w:tr>
         <w:tc>
           <w:tcPr>
-            <w:tcW w:type="dxa" w:w="4824"/>
+            <w:tcW w:type="dxa" w:w="3216"/>
           </w:tcPr>
           <w:p>
             <w:r>
@@ -1503,7 +1673,7 @@
         </w:tc>
         <w:tc>
           <w:tcPr>
-            <w:tcW w:type="dxa" w:w="4824"/>
+            <w:tcW w:type="dxa" w:w="3216"/>
           </w:tcPr>
           <w:p>
             <w:r>
@@ -1515,7 +1685,40 @@
               <w:rPr>
                 <w:sz w:val="18"/>
               </w:rPr>
-              <w:t>OAuth Client secret from Step 4</w:t>
+              <w:t xml:space="preserve">OAuth </w:t>
+            </w:r>
+            <w:r>
+              <w:rPr>
+                <w:b/>
+                <w:sz w:val="18"/>
+              </w:rPr>
+              <w:t>Client secret</w:t>
+            </w:r>
+            <w:r>
+              <w:rPr>
+                <w:sz w:val="18"/>
+              </w:rPr>
+              <w:t xml:space="preserve"> from Step 4</w:t>
+            </w:r>
+          </w:p>
+        </w:tc>
+        <w:tc>
+          <w:tcPr>
+            <w:tcW w:type="dxa" w:w="3216"/>
+          </w:tcPr>
+          <w:p>
+            <w:r>
+              <w:rPr>
+                <w:sz w:val="18"/>
+              </w:rPr>
+            </w:r>
+            <w:r>
+              <w:rPr>
+                <w:rFonts w:ascii="Consolas" w:hAnsi="Consolas"/>
+                <w:color w:val="115E59"/>
+                <w:sz w:val="18"/>
+              </w:rPr>
+              <w:t>GOCSPX-abcdefghijklmnopqrstuvwx</w:t>
             </w:r>
           </w:p>
         </w:tc>
@@ -1524,6 +1727,84 @@
     <w:p/>
     <w:p>
       <w:r>
+        <w:rPr>
+          <w:b/>
+        </w:rPr>
+        <w:t>Easy identification</w:t>
+      </w:r>
+    </w:p>
+    <w:p>
+      <w:pPr>
+        <w:pStyle w:val="ListBullet"/>
+      </w:pPr>
+      <w:r>
+        <w:rPr>
+          <w:b/>
+        </w:rPr>
+        <w:t>Client ID</w:t>
+      </w:r>
+      <w:r>
+        <w:t xml:space="preserve"> is long, ends with </w:t>
+      </w:r>
+      <w:r>
+        <w:rPr>
+          <w:rFonts w:ascii="Consolas" w:hAnsi="Consolas"/>
+          <w:color w:val="115E59"/>
+          <w:sz w:val="20"/>
+        </w:rPr>
+        <w:t>.apps.googleusercontent.com</w:t>
+      </w:r>
+    </w:p>
+    <w:p>
+      <w:pPr>
+        <w:pStyle w:val="ListBullet"/>
+      </w:pPr>
+      <w:r>
+        <w:rPr>
+          <w:b/>
+        </w:rPr>
+        <w:t>Client secret</w:t>
+      </w:r>
+      <w:r>
+        <w:t xml:space="preserve"> is shorter and usually starts with </w:t>
+      </w:r>
+      <w:r>
+        <w:rPr>
+          <w:rFonts w:ascii="Consolas" w:hAnsi="Consolas"/>
+          <w:color w:val="115E59"/>
+          <w:sz w:val="20"/>
+        </w:rPr>
+        <w:t>GOCSPX-</w:t>
+      </w:r>
+    </w:p>
+    <w:p>
+      <w:r>
+        <w:t>Example when setting via CLI:</w:t>
+      </w:r>
+    </w:p>
+    <w:p>
+      <w:pPr>
+        <w:ind w:left="216"/>
+      </w:pPr>
+      <w:r>
+        <w:rPr>
+          <w:rFonts w:ascii="Consolas" w:hAnsi="Consolas"/>
+          <w:sz w:val="18"/>
+        </w:rPr>
+        <w:t>supabase secrets set \</w:t>
+        <w:br/>
+        <w:t xml:space="preserve">  GOOGLE_OAUTH_CLIENT_ID="123456789012-abcdefghijklmnop.apps.googleusercontent.com" \</w:t>
+        <w:br/>
+        <w:t xml:space="preserve">  GOOGLE_OAUTH_CLIENT_SECRET="GOCSPX-abcdefghijklmnopqrstuvwx"</w:t>
+      </w:r>
+    </w:p>
+    <w:p>
+      <w:r>
+        <w:t>(Replace with your real values from Google Cloud → Credentials → your OAuth client.)</w:t>
+      </w:r>
+    </w:p>
+    <w:p>
+      <w:r>
         <w:t>Also ensure the functions have normal Supabase runtime env (usually automatic):</w:t>
       </w:r>
     </w:p>
@@ -1593,6 +1874,20 @@
           <w:i/>
           <w:color w:val="475569"/>
         </w:rPr>
+        <w:t xml:space="preserve"> put Client Secret in the frontend / Vercel env. Only Edge Function secrets.</w:t>
+      </w:r>
+    </w:p>
+    <w:p>
+      <w:r>
+        <w:t xml:space="preserve">&gt; Do </w:t>
+      </w:r>
+      <w:r>
+        <w:rPr>
+          <w:b/>
+        </w:rPr>
+        <w:t>not</w:t>
+      </w:r>
+      <w:r>
         <w:t xml:space="preserve"> put Client Secret in the frontend / Vercel env. Only Edge Function secrets.</w:t>
       </w:r>
     </w:p>
@@ -2811,7 +3106,7 @@
         <w:pStyle w:val="Heading1"/>
       </w:pPr>
       <w:r>
-        <w:t>Step 11 — Verify with Debug</w:t>
+        <w:t>Step 11 — Verify connection</w:t>
       </w:r>
     </w:p>
     <w:p>
@@ -2825,19 +3120,19 @@
         <w:rPr>
           <w:b/>
         </w:rPr>
-        <w:t>Debug</w:t>
-      </w:r>
-      <w:r>
-        <w:t xml:space="preserve"> → </w:t>
+        <w:t>Google Drive</w:t>
+      </w:r>
+      <w:r>
+        <w:t xml:space="preserve"> shows </w:t>
       </w:r>
       <w:r>
         <w:rPr>
           <w:b/>
         </w:rPr>
-        <w:t>Run diagnostics</w:t>
-      </w:r>
-      <w:r>
-        <w:t>.</w:t>
+        <w:t>Google connected</w:t>
+      </w:r>
+      <w:r>
+        <w:t xml:space="preserve"> with your email.</w:t>
       </w:r>
     </w:p>
     <w:p>
@@ -2845,30 +3140,16 @@
         <w:pStyle w:val="ListNumber"/>
       </w:pPr>
       <w:r>
-        <w:t>Confirm hints include roughly:</w:t>
-      </w:r>
-    </w:p>
-    <w:p>
-      <w:r>
-        <w:t xml:space="preserve">   - </w:t>
+        <w:t xml:space="preserve">Folder ID is saved and status says </w:t>
       </w:r>
       <w:r>
         <w:rPr>
-          <w:rFonts w:ascii="Consolas" w:hAnsi="Consolas"/>
-          <w:color w:val="115E59"/>
-          <w:sz w:val="20"/>
+          <w:b/>
         </w:rPr>
-        <w:t>cms-full-backup OK (version 5+, chunked, all storage sync)</w:t>
-      </w:r>
-    </w:p>
-    <w:p>
-      <w:r>
-        <w:t xml:space="preserve">   - Google connected</w:t>
-      </w:r>
-    </w:p>
-    <w:p>
-      <w:r>
-        <w:t xml:space="preserve">   - Folder ID saved</w:t>
+        <w:t>Ready for Drive backups</w:t>
+      </w:r>
+      <w:r>
+        <w:t>.</w:t>
       </w:r>
     </w:p>
     <w:p>
@@ -2876,86 +3157,7 @@
         <w:pStyle w:val="ListNumber"/>
       </w:pPr>
       <w:r>
-        <w:t>Version probe should report:</w:t>
-      </w:r>
-    </w:p>
-    <w:p>
-      <w:r>
-        <w:t xml:space="preserve">   - </w:t>
-      </w:r>
-      <w:r>
-        <w:rPr>
-          <w:rFonts w:ascii="Consolas" w:hAnsi="Consolas"/>
-          <w:color w:val="115E59"/>
-          <w:sz w:val="20"/>
-        </w:rPr>
-        <w:t>complete_backup: true</w:t>
-      </w:r>
-    </w:p>
-    <w:p>
-      <w:r>
-        <w:t xml:space="preserve">   - </w:t>
-      </w:r>
-      <w:r>
-        <w:rPr>
-          <w:rFonts w:ascii="Consolas" w:hAnsi="Consolas"/>
-          <w:color w:val="115E59"/>
-          <w:sz w:val="20"/>
-        </w:rPr>
-        <w:t>chunked: true</w:t>
-      </w:r>
-    </w:p>
-    <w:p>
-      <w:r>
-        <w:t xml:space="preserve">   - </w:t>
-      </w:r>
-      <w:r>
-        <w:rPr>
-          <w:rFonts w:ascii="Consolas" w:hAnsi="Consolas"/>
-          <w:color w:val="115E59"/>
-          <w:sz w:val="20"/>
-        </w:rPr>
-        <w:t>version: 5</w:t>
-      </w:r>
-      <w:r>
-        <w:t xml:space="preserve"> (or higher)</w:t>
-      </w:r>
-    </w:p>
-    <w:p>
-      <w:r>
-        <w:t xml:space="preserve">   - </w:t>
-      </w:r>
-      <w:r>
-        <w:rPr>
-          <w:rFonts w:ascii="Consolas" w:hAnsi="Consolas"/>
-          <w:color w:val="115E59"/>
-          <w:sz w:val="20"/>
-        </w:rPr>
-        <w:t>supports</w:t>
-      </w:r>
-      <w:r>
-        <w:t xml:space="preserve"> includes </w:t>
-      </w:r>
-      <w:r>
-        <w:rPr>
-          <w:rFonts w:ascii="Consolas" w:hAnsi="Consolas"/>
-          <w:color w:val="115E59"/>
-          <w:sz w:val="20"/>
-        </w:rPr>
-        <w:t>storage_sync</w:t>
-      </w:r>
-    </w:p>
-    <w:p>
-      <w:r>
-        <w:t xml:space="preserve">   - </w:t>
-      </w:r>
-      <w:r>
-        <w:rPr>
-          <w:rFonts w:ascii="Consolas" w:hAnsi="Consolas"/>
-          <w:color w:val="115E59"/>
-          <w:sz w:val="20"/>
-        </w:rPr>
-        <w:t>sync_buckets: "all"</w:t>
+        <w:t>Optional: open Supabase Edge Function logs after clicking Connect / Run Backup if something fails.</w:t>
       </w:r>
     </w:p>
     <w:p>
@@ -3324,14 +3526,6 @@
       </w:pPr>
       <w:r>
         <w:t>☐ Drive folder created + Folder ID saved</w:t>
-      </w:r>
-    </w:p>
-    <w:p>
-      <w:pPr>
-        <w:pStyle w:val="ListBullet"/>
-      </w:pPr>
-      <w:r>
-        <w:t>☐ Debug OK</w:t>
       </w:r>
     </w:p>
     <w:p>

</xml_diff>